<commit_message>
feat(sso): add SSO configuration options and enhance login security; implement encrypted UUID for user IDs
</commit_message>
<xml_diff>
--- a/template/SK-1/BA Penilaian SK I sd SK III TEMPLATE.docx
+++ b/template/SK-1/BA Penilaian SK I sd SK III TEMPLATE.docx
@@ -1542,6 +1542,20 @@
                 <w:color w:val="000000" w:themeColor="text1"/>
               </w:rPr>
             </w:pPr>
+            <w:r>
+              <w:rPr>
+                <w:color w:val="000000" w:themeColor="text1"/>
+                <w:spacing w:val="-10"/>
+              </w:rPr>
+              <w:t>${nilai_rata2}</w:t>
+            </w:r>
+            <w:r>
+              <w:rPr>
+                <w:color w:val="000000" w:themeColor="text1"/>
+                <w:lang w:val="en-US"/>
+              </w:rPr>
+              <w:t/>
+            </w:r>
           </w:p>
         </w:tc>
         <w:tc>
@@ -1842,6 +1856,20 @@
                 <w:color w:val="000000" w:themeColor="text1"/>
               </w:rPr>
             </w:pPr>
+            <w:r>
+              <w:rPr>
+                <w:color w:val="000000" w:themeColor="text1"/>
+                <w:spacing w:val="-10"/>
+              </w:rPr>
+              <w:t>${nilai_rata2}</w:t>
+            </w:r>
+            <w:r>
+              <w:rPr>
+                <w:color w:val="000000" w:themeColor="text1"/>
+                <w:lang w:val="en-US"/>
+              </w:rPr>
+              <w:t/>
+            </w:r>
           </w:p>
         </w:tc>
         <w:tc>

</xml_diff>

<commit_message>
feat(template): enhance document templates by adding placeholders for examiners and adjusting signature placement for SK-4, improving document formatting and clarity
</commit_message>
<xml_diff>
--- a/template/SK-1/BA Penilaian SK I sd SK III TEMPLATE.docx
+++ b/template/SK-1/BA Penilaian SK I sd SK III TEMPLATE.docx
@@ -2340,6 +2340,7 @@
               <w:pStyle w:val="TableParagraph"/>
               <w:spacing w:before="95"/>
               <w:ind w:left="197"/>
+              <w:jc w:val="center"/>
               <w:rPr>
                 <w:color w:val="000000" w:themeColor="text1"/>
                 <w:sz w:val="24"/>
@@ -2485,6 +2486,7 @@
               <w:pStyle w:val="TableParagraph"/>
               <w:spacing w:before="36"/>
               <w:ind w:left="197"/>
+              <w:jc w:val="center"/>
               <w:rPr>
                 <w:color w:val="000000" w:themeColor="text1"/>
                 <w:sz w:val="24"/>
@@ -2633,6 +2635,7 @@
               <w:pStyle w:val="TableParagraph"/>
               <w:spacing w:before="36"/>
               <w:ind w:left="197"/>
+              <w:jc w:val="center"/>
               <w:rPr>
                 <w:color w:val="000000" w:themeColor="text1"/>
                 <w:sz w:val="24"/>
@@ -2730,25 +2733,7 @@
                 <w:sz w:val="24"/>
                 <w:szCs w:val="24"/>
               </w:rPr>
-              <w:t>(Penguji</w:t>
-            </w:r>
-            <w:r>
-              <w:rPr>
-                <w:color w:val="000000" w:themeColor="text1"/>
-                <w:spacing w:val="-2"/>
-                <w:sz w:val="24"/>
-                <w:szCs w:val="24"/>
-              </w:rPr>
-              <w:t>-1</w:t>
-            </w:r>
-            <w:r>
-              <w:rPr>
-                <w:color w:val="000000" w:themeColor="text1"/>
-                <w:spacing w:val="-2"/>
-                <w:sz w:val="24"/>
-                <w:szCs w:val="24"/>
-              </w:rPr>
-              <w:t>)</w:t>
+              <w:t>(Penguji)</w:t>
             </w:r>
           </w:p>
         </w:tc>
@@ -2762,6 +2747,7 @@
               <w:pStyle w:val="TableParagraph"/>
               <w:spacing w:before="36"/>
               <w:ind w:left="197"/>
+              <w:jc w:val="center"/>
               <w:rPr>
                 <w:color w:val="000000" w:themeColor="text1"/>
                 <w:sz w:val="24"/>
@@ -2868,7 +2854,7 @@
                 <w:sz w:val="24"/>
                 <w:szCs w:val="24"/>
               </w:rPr>
-              <w:t>i-2</w:t>
+              <w:t>i</w:t>
             </w:r>
             <w:r>
               <w:rPr>
@@ -2891,6 +2877,21 @@
               <w:pStyle w:val="TableParagraph"/>
               <w:spacing w:before="34" w:line="233" w:lineRule="exact"/>
               <w:ind w:left="197"/>
+              <w:jc w:val="center"/>
+              <w:rPr>
+                <w:color w:val="000000" w:themeColor="text1"/>
+                <w:spacing w:val="-2"/>
+                <w:sz w:val="24"/>
+                <w:szCs w:val="24"/>
+              </w:rPr>
+            </w:pPr>
+          </w:p>
+          <w:p>
+            <w:pPr>
+              <w:pStyle w:val="TableParagraph"/>
+              <w:spacing w:before="34" w:line="233" w:lineRule="exact"/>
+              <w:ind w:left="197"/>
+              <w:jc w:val="center"/>
               <w:rPr>
                 <w:color w:val="000000" w:themeColor="text1"/>
                 <w:sz w:val="24"/>
@@ -3019,28 +3020,6 @@
           <w:color w:val="000000" w:themeColor="text1"/>
           <w:spacing w:val="-2"/>
           <w:sz w:val="22"/>
-        </w:rPr>
-      </w:pPr>
-    </w:p>
-    <w:p>
-      <w:pPr>
-        <w:ind w:left="4680" w:right="938"/>
-        <w:rPr>
-          <w:b/>
-          <w:bCs/>
-          <w:color w:val="000000" w:themeColor="text1"/>
-          <w:u w:val="single"/>
-        </w:rPr>
-      </w:pPr>
-    </w:p>
-    <w:p>
-      <w:pPr>
-        <w:ind w:left="4680" w:right="938"/>
-        <w:rPr>
-          <w:b/>
-          <w:bCs/>
-          <w:color w:val="000000" w:themeColor="text1"/>
-          <w:u w:val="single"/>
         </w:rPr>
       </w:pPr>
     </w:p>
@@ -3732,7 +3711,7 @@
       </w:pPr>
     </w:lvl>
   </w:abstractNum>
-  <w:num w:numId="1" w16cid:durableId="2134014344">
+  <w:num w:numId="1" w16cid:durableId="97680962">
     <w:abstractNumId w:val="0"/>
   </w:num>
 </w:numbering>
@@ -4150,6 +4129,7 @@
   <w:style w:type="character" w:default="1" w:styleId="DefaultParagraphFont">
     <w:name w:val="Default Paragraph Font"/>
     <w:uiPriority w:val="1"/>
+    <w:semiHidden/>
     <w:unhideWhenUsed/>
   </w:style>
   <w:style w:type="table" w:default="1" w:styleId="TableNormal">

</xml_diff>

<commit_message>
refactor(tahap): improve button functionality and layout in tables for enhanced user interaction and visual consistency
</commit_message>
<xml_diff>
--- a/template/SK-1/BA Penilaian SK I sd SK III TEMPLATE.docx
+++ b/template/SK-1/BA Penilaian SK I sd SK III TEMPLATE.docx
@@ -168,6 +168,7 @@
         </w:rPr>
         <w:t xml:space="preserve"> </w:t>
       </w:r>
+      <w:proofErr w:type="spellStart"/>
       <w:r>
         <w:rPr>
           <w:rFonts w:ascii="Times New Roman" w:hAnsi="Times New Roman" w:cs="Times New Roman"/>
@@ -176,6 +177,7 @@
         </w:rPr>
         <w:t>Mahasiswa</w:t>
       </w:r>
+      <w:proofErr w:type="spellEnd"/>
       <w:r>
         <w:rPr>
           <w:rFonts w:ascii="Times New Roman" w:hAnsi="Times New Roman" w:cs="Times New Roman"/>
@@ -212,7 +214,23 @@
           <w:rFonts w:ascii="Times New Roman" w:eastAsia="Batang" w:hAnsi="Times New Roman" w:cs="Times New Roman"/>
           <w:color w:val="000000" w:themeColor="text1"/>
         </w:rPr>
-        <w:t>nama mhs)</w:t>
+        <w:t xml:space="preserve">nama </w:t>
+      </w:r>
+      <w:proofErr w:type="spellStart"/>
+      <w:r>
+        <w:rPr>
+          <w:rFonts w:ascii="Times New Roman" w:eastAsia="Batang" w:hAnsi="Times New Roman" w:cs="Times New Roman"/>
+          <w:color w:val="000000" w:themeColor="text1"/>
+        </w:rPr>
+        <w:t>mhs</w:t>
+      </w:r>
+      <w:proofErr w:type="spellEnd"/>
+      <w:r>
+        <w:rPr>
+          <w:rFonts w:ascii="Times New Roman" w:eastAsia="Batang" w:hAnsi="Times New Roman" w:cs="Times New Roman"/>
+          <w:color w:val="000000" w:themeColor="text1"/>
+        </w:rPr>
+        <w:t>)</w:t>
       </w:r>
     </w:p>
     <w:p>
@@ -304,6 +322,7 @@
           <w:color w:val="000000" w:themeColor="text1"/>
         </w:rPr>
       </w:pPr>
+      <w:proofErr w:type="spellStart"/>
       <w:r>
         <w:rPr>
           <w:rFonts w:ascii="Times New Roman" w:hAnsi="Times New Roman" w:cs="Times New Roman"/>
@@ -311,6 +330,7 @@
         </w:rPr>
         <w:t>Judul</w:t>
       </w:r>
+      <w:proofErr w:type="spellEnd"/>
       <w:r>
         <w:rPr>
           <w:rFonts w:ascii="Times New Roman" w:hAnsi="Times New Roman" w:cs="Times New Roman"/>
@@ -319,6 +339,7 @@
         </w:rPr>
         <w:t xml:space="preserve"> </w:t>
       </w:r>
+      <w:proofErr w:type="spellStart"/>
       <w:r>
         <w:rPr>
           <w:rFonts w:ascii="Times New Roman" w:hAnsi="Times New Roman" w:cs="Times New Roman"/>
@@ -327,6 +348,7 @@
         </w:rPr>
         <w:t>Penelitian</w:t>
       </w:r>
+      <w:proofErr w:type="spellEnd"/>
       <w:r>
         <w:rPr>
           <w:rFonts w:ascii="Times New Roman" w:hAnsi="Times New Roman" w:cs="Times New Roman"/>
@@ -364,7 +386,25 @@
           <w:rFonts w:ascii="Times New Roman" w:hAnsi="Times New Roman" w:cs="Times New Roman"/>
           <w:color w:val="000000" w:themeColor="text1"/>
         </w:rPr>
-        <w:t>(judul)</w:t>
+        <w:t>(</w:t>
+      </w:r>
+      <w:proofErr w:type="spellStart"/>
+      <w:r>
+        <w:rPr>
+          <w:rStyle w:val="fontstyle01"/>
+          <w:rFonts w:ascii="Times New Roman" w:hAnsi="Times New Roman" w:cs="Times New Roman"/>
+          <w:color w:val="000000" w:themeColor="text1"/>
+        </w:rPr>
+        <w:t>judul</w:t>
+      </w:r>
+      <w:proofErr w:type="spellEnd"/>
+      <w:r>
+        <w:rPr>
+          <w:rStyle w:val="fontstyle01"/>
+          <w:rFonts w:ascii="Times New Roman" w:hAnsi="Times New Roman" w:cs="Times New Roman"/>
+          <w:color w:val="000000" w:themeColor="text1"/>
+        </w:rPr>
+        <w:t>)</w:t>
       </w:r>
     </w:p>
     <w:p>
@@ -385,7 +425,23 @@
           <w:rFonts w:ascii="Times New Roman" w:hAnsi="Times New Roman" w:cs="Times New Roman"/>
           <w:color w:val="000000" w:themeColor="text1"/>
         </w:rPr>
-        <w:t>Hari/Tanggal Seminar</w:t>
+        <w:t>Hari/</w:t>
+      </w:r>
+      <w:proofErr w:type="spellStart"/>
+      <w:r>
+        <w:rPr>
+          <w:rFonts w:ascii="Times New Roman" w:hAnsi="Times New Roman" w:cs="Times New Roman"/>
+          <w:color w:val="000000" w:themeColor="text1"/>
+        </w:rPr>
+        <w:t>Tanggal</w:t>
+      </w:r>
+      <w:proofErr w:type="spellEnd"/>
+      <w:r>
+        <w:rPr>
+          <w:rFonts w:ascii="Times New Roman" w:hAnsi="Times New Roman" w:cs="Times New Roman"/>
+          <w:color w:val="000000" w:themeColor="text1"/>
+        </w:rPr>
+        <w:t xml:space="preserve"> Seminar</w:t>
       </w:r>
       <w:r>
         <w:rPr>
@@ -409,6 +465,7 @@
         </w:rPr>
         <w:t>${tgl_sidang}</w:t>
       </w:r>
+      <w:proofErr w:type="spellStart"/>
       <w:r>
         <w:rPr>
           <w:rFonts w:ascii="Times New Roman" w:hAnsi="Times New Roman" w:cs="Times New Roman"/>
@@ -416,6 +473,15 @@
         </w:rPr>
         <w:t/>
       </w:r>
+      <w:proofErr w:type="spellEnd"/>
+      <w:r>
+        <w:rPr>
+          <w:rFonts w:ascii="Times New Roman" w:hAnsi="Times New Roman" w:cs="Times New Roman"/>
+          <w:color w:val="000000" w:themeColor="text1"/>
+        </w:rPr>
+        <w:t xml:space="preserve"/>
+      </w:r>
+      <w:proofErr w:type="spellStart"/>
       <w:r>
         <w:rPr>
           <w:rFonts w:ascii="Times New Roman" w:hAnsi="Times New Roman" w:cs="Times New Roman"/>
@@ -423,13 +489,37 @@
         </w:rPr>
         <w:t/>
       </w:r>
+      <w:proofErr w:type="spellEnd"/>
+      <w:r>
+        <w:rPr>
+          <w:rFonts w:ascii="Times New Roman" w:hAnsi="Times New Roman" w:cs="Times New Roman"/>
+          <w:color w:val="000000" w:themeColor="text1"/>
+        </w:rPr>
+        <w:t/>
+      </w:r>
       <w:r>
         <w:rPr>
           <w:rFonts w:ascii="Times New Roman" w:hAnsi="Times New Roman" w:cs="Times New Roman"/>
           <w:color w:val="000000" w:themeColor="text1"/>
         </w:rPr>
         <w:tab/>
-        <w:t xml:space="preserve">Jam:  Pkl </w:t>
+        <w:t xml:space="preserve">Jam:  </w:t>
+      </w:r>
+      <w:proofErr w:type="spellStart"/>
+      <w:r>
+        <w:rPr>
+          <w:rFonts w:ascii="Times New Roman" w:hAnsi="Times New Roman" w:cs="Times New Roman"/>
+          <w:color w:val="000000" w:themeColor="text1"/>
+        </w:rPr>
+        <w:t>Pkl</w:t>
+      </w:r>
+      <w:proofErr w:type="spellEnd"/>
+      <w:r>
+        <w:rPr>
+          <w:rFonts w:ascii="Times New Roman" w:hAnsi="Times New Roman" w:cs="Times New Roman"/>
+          <w:color w:val="000000" w:themeColor="text1"/>
+        </w:rPr>
+        <w:t xml:space="preserve"> </w:t>
       </w:r>
       <w:r>
         <w:rPr>
@@ -439,6 +529,7 @@
         </w:rPr>
         <w:t>${waktu}</w:t>
       </w:r>
+      <w:proofErr w:type="spellStart"/>
       <w:r>
         <w:rPr>
           <w:rFonts w:ascii="Times New Roman" w:hAnsi="Times New Roman" w:cs="Times New Roman"/>
@@ -446,6 +537,7 @@
         </w:rPr>
         <w:t/>
       </w:r>
+      <w:proofErr w:type="spellEnd"/>
       <w:r>
         <w:rPr>
           <w:rFonts w:ascii="Times New Roman" w:hAnsi="Times New Roman" w:cs="Times New Roman"/>
@@ -488,6 +580,7 @@
           <w:color w:val="000000" w:themeColor="text1"/>
         </w:rPr>
       </w:pPr>
+      <w:proofErr w:type="spellStart"/>
       <w:r>
         <w:rPr>
           <w:rFonts w:ascii="Times New Roman" w:hAnsi="Times New Roman" w:cs="Times New Roman"/>
@@ -495,6 +588,7 @@
         </w:rPr>
         <w:t>Penilaian</w:t>
       </w:r>
+      <w:proofErr w:type="spellEnd"/>
     </w:p>
     <w:tbl>
       <w:tblPr>
@@ -2274,7 +2368,27 @@
                 <w:szCs w:val="24"/>
                 <w:lang w:val="en-US"/>
               </w:rPr>
+              <w:t xml:space="preserve"/>
+            </w:r>
+            <w:proofErr w:type="spellStart"/>
+            <w:r>
+              <w:rPr>
+                <w:color w:val="000000" w:themeColor="text1"/>
+                <w:sz w:val="24"/>
+                <w:szCs w:val="24"/>
+                <w:lang w:val="en-US"/>
+              </w:rPr>
               <w:t/>
+            </w:r>
+            <w:proofErr w:type="spellEnd"/>
+            <w:r>
+              <w:rPr>
+                <w:color w:val="000000" w:themeColor="text1"/>
+                <w:sz w:val="24"/>
+                <w:szCs w:val="24"/>
+                <w:lang w:val="en-US"/>
+              </w:rPr>
+              <w:t xml:space="preserve"/>
             </w:r>
             <w:r>
               <w:rPr>
@@ -2420,7 +2534,27 @@
                 <w:szCs w:val="24"/>
                 <w:lang w:val="en-US"/>
               </w:rPr>
+              <w:t xml:space="preserve"/>
+            </w:r>
+            <w:proofErr w:type="spellStart"/>
+            <w:r>
+              <w:rPr>
+                <w:color w:val="000000" w:themeColor="text1"/>
+                <w:sz w:val="24"/>
+                <w:szCs w:val="24"/>
+                <w:lang w:val="en-US"/>
+              </w:rPr>
               <w:t/>
+            </w:r>
+            <w:proofErr w:type="spellEnd"/>
+            <w:r>
+              <w:rPr>
+                <w:color w:val="000000" w:themeColor="text1"/>
+                <w:sz w:val="24"/>
+                <w:szCs w:val="24"/>
+                <w:lang w:val="en-US"/>
+              </w:rPr>
+              <w:t xml:space="preserve"/>
             </w:r>
             <w:r>
               <w:rPr>
@@ -2569,7 +2703,27 @@
                 <w:szCs w:val="24"/>
                 <w:lang w:val="en-US"/>
               </w:rPr>
+              <w:t xml:space="preserve"/>
+            </w:r>
+            <w:proofErr w:type="spellStart"/>
+            <w:r>
+              <w:rPr>
+                <w:color w:val="000000" w:themeColor="text1"/>
+                <w:sz w:val="24"/>
+                <w:szCs w:val="24"/>
+                <w:lang w:val="en-US"/>
+              </w:rPr>
               <w:t/>
+            </w:r>
+            <w:proofErr w:type="spellEnd"/>
+            <w:r>
+              <w:rPr>
+                <w:color w:val="000000" w:themeColor="text1"/>
+                <w:sz w:val="24"/>
+                <w:szCs w:val="24"/>
+                <w:lang w:val="en-US"/>
+              </w:rPr>
+              <w:t xml:space="preserve"/>
             </w:r>
             <w:r>
               <w:rPr>
@@ -2950,6 +3104,7 @@
         </w:rPr>
         <w:t>${tgl_sidang}</w:t>
       </w:r>
+      <w:proofErr w:type="spellStart"/>
       <w:r>
         <w:rPr>
           <w:color w:val="000000" w:themeColor="text1"/>
@@ -2957,6 +3112,23 @@
         </w:rPr>
         <w:t/>
       </w:r>
+      <w:proofErr w:type="spellEnd"/>
+      <w:r>
+        <w:rPr>
+          <w:color w:val="000000" w:themeColor="text1"/>
+          <w:sz w:val="22"/>
+        </w:rPr>
+        <w:t xml:space="preserve"/>
+      </w:r>
+      <w:proofErr w:type="spellStart"/>
+      <w:r>
+        <w:rPr>
+          <w:color w:val="000000" w:themeColor="text1"/>
+          <w:sz w:val="22"/>
+        </w:rPr>
+        <w:t/>
+      </w:r>
+      <w:proofErr w:type="spellEnd"/>
       <w:r>
         <w:rPr>
           <w:color w:val="000000" w:themeColor="text1"/>
@@ -2974,6 +3146,7 @@
           <w:sz w:val="22"/>
         </w:rPr>
       </w:pPr>
+      <w:proofErr w:type="spellStart"/>
       <w:r>
         <w:rPr>
           <w:color w:val="000000" w:themeColor="text1"/>
@@ -2981,6 +3154,7 @@
         </w:rPr>
         <w:t>Ketua</w:t>
       </w:r>
+      <w:proofErr w:type="spellEnd"/>
       <w:r>
         <w:rPr>
           <w:color w:val="000000" w:themeColor="text1"/>
@@ -3010,8 +3184,18 @@
           <w:spacing w:val="-2"/>
           <w:sz w:val="22"/>
         </w:rPr>
-        <w:t>Studi Teknik Geofisika</w:t>
-      </w:r>
+        <w:t xml:space="preserve">Studi Teknik </w:t>
+      </w:r>
+      <w:proofErr w:type="spellStart"/>
+      <w:r>
+        <w:rPr>
+          <w:color w:val="000000" w:themeColor="text1"/>
+          <w:spacing w:val="-2"/>
+          <w:sz w:val="22"/>
+        </w:rPr>
+        <w:t>Geofisika</w:t>
+      </w:r>
+      <w:proofErr w:type="spellEnd"/>
     </w:p>
     <w:p>
       <w:pPr>
@@ -3030,7 +3214,6 @@
           <w:b/>
           <w:bCs/>
           <w:color w:val="000000" w:themeColor="text1"/>
-          <w:u w:val="single"/>
         </w:rPr>
       </w:pPr>
       <w:r>
@@ -3038,7 +3221,6 @@
           <w:b/>
           <w:bCs/>
           <w:color w:val="000000" w:themeColor="text1"/>
-          <w:u w:val="single"/>
           <w:lang w:val="id-ID"/>
         </w:rPr>
         <w:t>${signature}</w:t>
@@ -3070,6 +3252,26 @@
           <w:color w:val="000000" w:themeColor="text1"/>
           <w:u w:val="single"/>
         </w:rPr>
+        <w:t xml:space="preserve"/>
+      </w:r>
+      <w:proofErr w:type="spellStart"/>
+      <w:r>
+        <w:rPr>
+          <w:b/>
+          <w:bCs/>
+          <w:color w:val="000000" w:themeColor="text1"/>
+          <w:u w:val="single"/>
+        </w:rPr>
+        <w:t/>
+      </w:r>
+      <w:proofErr w:type="spellEnd"/>
+      <w:r>
+        <w:rPr>
+          <w:b/>
+          <w:bCs/>
+          <w:color w:val="000000" w:themeColor="text1"/>
+          <w:u w:val="single"/>
+        </w:rPr>
         <w:t/>
       </w:r>
     </w:p>
@@ -3095,6 +3297,20 @@
         </w:rPr>
         <w:t>${nip_kaprodi}</w:t>
       </w:r>
+      <w:r>
+        <w:rPr>
+          <w:color w:val="000000" w:themeColor="text1"/>
+        </w:rPr>
+        <w:t xml:space="preserve"/>
+      </w:r>
+      <w:proofErr w:type="spellStart"/>
+      <w:r>
+        <w:rPr>
+          <w:color w:val="000000" w:themeColor="text1"/>
+        </w:rPr>
+        <w:t/>
+      </w:r>
+      <w:proofErr w:type="spellEnd"/>
       <w:r>
         <w:rPr>
           <w:color w:val="000000" w:themeColor="text1"/>

</xml_diff>